<commit_message>
Cap nhat tai lieu Word: 2P, chuoi khoi chung, bang phim moi
</commit_message>
<xml_diff>
--- a/Giai_thich_code_Tetris.docx
+++ b/Giai_thich_code_Tetris.docx
@@ -13,7 +13,7 @@
     </w:p>
     <w:p>
       <w:r>
-        <w:t>Tài liệu mô tả chức năng từng hàm và cách hoạt động của toàn bộ chương trình, gồm 5 file: settings.py, pieces.py, game.py, menu.py, main.py. Lưới chơi 10×20, 7 khối Tetromino, 3 tốc độ rơi, 3 độ khó, chế độ 1 người chơi (khung 2 người chơi làm ở Ngày 5–6).</w:t>
+        <w:t>Tài liệu mô tả chức năng từng hàm và cách hoạt động của toàn bộ chương trình, gồm 5 file: settings.py, pieces.py, game.py, menu.py, main.py. Lưới chơi 10×20, 7 khối Tetromino, 3 tốc độ rơi, 3 độ khó, chế độ 1 người chơi và 2 người chơi (2 bảng cạnh nhau, dùng chung chuỗi khối để công bằng).</w:t>
       </w:r>
     </w:p>
     <w:p>
@@ -26,7 +26,7 @@
     </w:p>
     <w:p>
       <w:r>
-        <w:t>Chương trình chia theo mô hình: cấu hình (settings) + dữ liệu khối (pieces) + logic bàn chơi (game.Board) + menu + vòng lặp chính (main). Mỗi người chơi có 1 đối tượng Board riêng, nên chế độ 2 người chỉ việc tạo 2 Board đọc chung 1 chuỗi khối.</w:t>
+        <w:t>Chương trình chia theo mô hình: cấu hình (settings) + dữ liệu khối (pieces) + logic bàn chơi (game.Board) + menu + vòng lặp chính (main). Mỗi người chơi có 1 đối tượng Board riêng. Chế độ 2 người chơi tạo 2 Board cùng đọc 1 chuỗi khối chung (SharedSequence) nên hai bên luôn nhận đúng cùng loại khối mỗi lượt.</w:t>
       </w:r>
     </w:p>
     <w:tbl>
@@ -109,7 +109,7 @@
           </w:tcPr>
           <w:p>
             <w:r>
-              <w:t>Định nghĩa 7 khối + class Piece + chuỗi khối chung SharedSequence</w:t>
+              <w:t>7 khối + class Piece + chuỗi khối chung SharedSequence (7-bag)</w:t>
             </w:r>
           </w:p>
         </w:tc>
@@ -153,7 +153,7 @@
           </w:tcPr>
           <w:p>
             <w:r>
-              <w:t>Class Menu: màn hình chọn chế độ 1P/2P và độ khó Dễ/TB/Khó</w:t>
+              <w:t>Class Menu: chọn chế độ 1P/2P rồi chọn độ khó Dễ/TB/Khó</w:t>
             </w:r>
           </w:p>
         </w:tc>
@@ -175,7 +175,7 @@
           </w:tcPr>
           <w:p>
             <w:r>
-              <w:t>Vòng lặp game: máy trạng thái menu/playing, đọc phím, gọi Board</w:t>
+              <w:t>Vòng lặp game: máy trạng thái menu/playing/playing_2p, đọc phím</w:t>
             </w:r>
           </w:p>
         </w:tc>
@@ -184,7 +184,7 @@
     <w:p/>
     <w:p>
       <w:r>
-        <w:t>Máy trạng thái trong main.py: menu (chọn chế độ/độ khó) → playing (chơi 1P) → màn hình thua nằm trong playing. Vòng lặp mỗi frame gồm 3 bước:</w:t>
+        <w:t>Máy trạng thái trong main.py: menu (chọn chế độ → chọn độ khó) → playing (1P) hoặc playing_2p (2P). Vòng lặp mỗi frame gồm 3 bước:</w:t>
       </w:r>
     </w:p>
     <w:p>
@@ -200,7 +200,7 @@
         <w:pStyle w:val="ListBullet"/>
       </w:pPr>
       <w:r>
-        <w:t>Bước 2 – Cập nhật: phím giữ (A/D di chuyển, S rơi nhanh) + Board.update(dt) cho khối rơi.</w:t>
+        <w:t>Bước 2 – Cập nhật: phím giữ (giữ trái/phải đi liên tục, giữ xuống rơi nhanh) + Board.update(dt) cho khối rơi.</w:t>
       </w:r>
     </w:p>
     <w:p>
@@ -294,7 +294,7 @@
           </w:tcPr>
           <w:p>
             <w:r>
-              <w:t>SIDEBAR, WIDTH, HEIGHT</w:t>
+              <w:t>SIDEBAR, PLAYER_WIDTH</w:t>
             </w:r>
           </w:p>
         </w:tc>
@@ -304,7 +304,29 @@
           </w:tcPr>
           <w:p>
             <w:r>
-              <w:t>Panel phải 200px; cửa sổ 500×600</w:t>
+              <w:t>Panel phải 200px; mỗi người chơi chiếm 500px</w:t>
+            </w:r>
+          </w:p>
+        </w:tc>
+      </w:tr>
+      <w:tr>
+        <w:tc>
+          <w:tcPr>
+            <w:tcW w:type="dxa" w:w="4320"/>
+          </w:tcPr>
+          <w:p>
+            <w:r>
+              <w:t>WIDTH, WIDTH_2P</w:t>
+            </w:r>
+          </w:p>
+        </w:tc>
+        <w:tc>
+          <w:tcPr>
+            <w:tcW w:type="dxa" w:w="4320"/>
+          </w:tcPr>
+          <w:p>
+            <w:r>
+              <w:t>Cửa sổ 1P 500×600; cửa sổ 2P 1000×600</w:t>
             </w:r>
           </w:p>
         </w:tc>
@@ -370,7 +392,7 @@
           </w:tcPr>
           <w:p>
             <w:r>
-              <w:t>0.05 giây/ô khi giữ S (rơi nhanh)</w:t>
+              <w:t>0.05 giây/ô khi giữ phím rơi nhanh</w:t>
             </w:r>
           </w:p>
         </w:tc>
@@ -392,7 +414,7 @@
           </w:tcPr>
           <w:p>
             <w:r>
-              <w:t>Giữ A/D quá 0.18s thì lặp, mỗi 0.06s đi 1 ô</w:t>
+              <w:t>Giữ trái/phải quá 0.18s thì lặp, mỗi 0.06s đi 1 ô</w:t>
             </w:r>
           </w:p>
         </w:tc>
@@ -618,7 +640,7 @@
           </w:tcPr>
           <w:p>
             <w:r>
-              <w:t>Tạo khối: copy ma trận từ SHAPES (để xoay không hỏng mẫu gốc), lấy màu từ COLORS, spawn ở cột 3 hàng 0</w:t>
+              <w:t>Tạo khối: copy ma trận từ SHAPES (để xoay không hỏng mẫu gốc), lấy màu từ COLORS</w:t>
             </w:r>
           </w:p>
         </w:tc>
@@ -674,12 +696,12 @@
         <w:pStyle w:val="Heading2"/>
       </w:pPr>
       <w:r>
-        <w:t>3.3. Class SharedSequence – chuỗi khối chung (7-bag)</w:t>
+        <w:t>3.3. Class SharedSequence – chuỗi khối chung cho 2 người chơi</w:t>
       </w:r>
     </w:p>
     <w:p>
       <w:r>
-        <w:t>Mỗi Board đếm số khối mình đã spawn (spawn_count) rồi hỏi kind_at(spawn_count). Vì cả 2 board cùng đọc 1 danh sách nên thứ tự khối giống hệt nhau dù 2 bên chơi nhanh/chậm khác nhau. Bên trong dùng kiểu 7-bag: xáo từng túi đủ 7 loại rồi mới xáo túi tiếp, tránh ra 1 loại liên tục.</w:t>
+        <w:t>Đảm bảo công bằng: cả 2 Board cùng trỏ tới 1 SharedSequence. Board thứ k spawn khối bằng cách gọi consume_to(base + k) đọc khối tại vị trí đó rồi đẩy con trỏ chung (cursor) qua. Board kia sau này đọc đúng vị trí ấy sẽ nhận đúng khối đó, nên dù ai chơi nhanh chậm thế nào, khối hai bên nhận vẫn giống hệt nhau từng lượt. Bên trong dùng kiểu 7-bag: xáo từng túi đủ 7 loại rồi mới xáo túi tiếp, tránh ra 1 loại liên tục.</w:t>
       </w:r>
     </w:p>
     <w:tbl>
@@ -740,7 +762,51 @@
           </w:tcPr>
           <w:p>
             <w:r>
-              <w:t>Tạo RNG riêng (fix seed khi test cho ra chuỗi giống nhau) + danh sách rỗng</w:t>
+              <w:t>Seed gốc để sinh seed riêng cho từng túi; seed None thì random mỗi ván</w:t>
+            </w:r>
+          </w:p>
+        </w:tc>
+      </w:tr>
+      <w:tr>
+        <w:tc>
+          <w:tcPr>
+            <w:tcW w:type="dxa" w:w="4320"/>
+          </w:tcPr>
+          <w:p>
+            <w:r>
+              <w:t>_ensure(i)</w:t>
+            </w:r>
+          </w:p>
+        </w:tc>
+        <w:tc>
+          <w:tcPr>
+            <w:tcW w:type="dxa" w:w="4320"/>
+          </w:tcPr>
+          <w:p>
+            <w:r>
+              <w:t>Đảm bảo chuỗi đã xáo đủ dài tới vị trí i</w:t>
+            </w:r>
+          </w:p>
+        </w:tc>
+      </w:tr>
+      <w:tr>
+        <w:tc>
+          <w:tcPr>
+            <w:tcW w:type="dxa" w:w="4320"/>
+          </w:tcPr>
+          <w:p>
+            <w:r>
+              <w:t>_fill_bag(bag_index)</w:t>
+            </w:r>
+          </w:p>
+        </w:tc>
+        <w:tc>
+          <w:tcPr>
+            <w:tcW w:type="dxa" w:w="4320"/>
+          </w:tcPr>
+          <w:p>
+            <w:r>
+              <w:t>Xáo 1 túi 7 khối từ rng (seed gốc, số túi) — túi thứ k luôn giống nhau</w:t>
             </w:r>
           </w:p>
         </w:tc>
@@ -762,7 +828,29 @@
           </w:tcPr>
           <w:p>
             <w:r>
-              <w:t>Đảm bảo danh sách đủ dài tới i (thiếu thì xáo thêm túi mới), trả về loại khối thứ i</w:t>
+              <w:t>Xem khối ở vị trí i mà không tiêu thụ (dùng cho khung next)</w:t>
+            </w:r>
+          </w:p>
+        </w:tc>
+      </w:tr>
+      <w:tr>
+        <w:tc>
+          <w:tcPr>
+            <w:tcW w:type="dxa" w:w="4320"/>
+          </w:tcPr>
+          <w:p>
+            <w:r>
+              <w:t>consume_to(i)</w:t>
+            </w:r>
+          </w:p>
+        </w:tc>
+        <w:tc>
+          <w:tcPr>
+            <w:tcW w:type="dxa" w:w="4320"/>
+          </w:tcPr>
+          <w:p>
+            <w:r>
+              <w:t>Tiêu thụ khối ở vị trí i: đọc khối và đẩy con trỏ chung lên i+1</w:t>
             </w:r>
           </w:p>
         </w:tc>
@@ -779,7 +867,7 @@
     </w:p>
     <w:p>
       <w:r>
-        <w:t>Board giữ: grid (lưới màu, ô BLACK là trống), current (khối đang rơi), next_kind (khối kế tiếp), score/lines, speed_level, fall_timer/lock_timer, game_over, high (kỷ lục).</w:t>
+        <w:t>Board giữ: grid (lưới màu, ô BLACK là trống), current (khối đang rơi), next_kind (khối kế tiếp), score/lines, speed_level, fall_timer/lock_timer, game_over, high (kỷ lục), base_piece (mốc bắt đầu ván trong chuỗi chung), piece_count (số khối đã spawn).</w:t>
       </w:r>
     </w:p>
     <w:tbl>
@@ -840,7 +928,7 @@
           </w:tcPr>
           <w:p>
             <w:r>
-              <w:t>Tạo lưới trống, reset điểm/tốc độ theo độ khó, đọc kỷ lục từ file, spawn khối đầu</w:t>
+              <w:t>Ván mới: lưới trống, điểm/tốc độ theo độ khó, mốc chuỗi chung về 0, spawn khối đầu</w:t>
             </w:r>
           </w:p>
         </w:tc>
@@ -862,7 +950,7 @@
           </w:tcPr>
           <w:p>
             <w:r>
-              <w:t>Lấy loại khối từ chuỗi chung, căn giữa board theo bề rộng, reset đồng hồ; nếu vừa spawn đã đè lên gạch cũ thì game_over = True</w:t>
+              <w:t>Lấy khối tại vị trí (base_piece + piece_count) bằng consume_to, căn giữa board; nếu vừa spawn đã đè lên gạch cũ thì game_over = True</w:t>
             </w:r>
           </w:p>
         </w:tc>
@@ -884,7 +972,7 @@
           </w:tcPr>
           <w:p>
             <w:r>
-              <w:t>Kiểm tra vị trí có hợp lệ: vượt biên trái/phải/đáy hoặc đè lên ô đã khóa → False; cho phép y &lt; 0 (khối mới nhú ở mép trên)</w:t>
+              <w:t>Kiểm tra vị trí hợp lệ: vượt biên trái/phải/đáy hoặc đè lên ô đã khóa → False; cho phép y &lt; 0 (khối mới nhú ở mép trên)</w:t>
             </w:r>
           </w:p>
         </w:tc>
@@ -1060,7 +1148,7 @@
           </w:tcPr>
           <w:p>
             <w:r>
-              <w:t>Cho khối xuống tận đáy rồi khóa + spawn khối mới ngay (phím Space)</w:t>
+              <w:t>Cho khối xuống tận đáy rồi khóa + spawn khối mới ngay</w:t>
             </w:r>
           </w:p>
         </w:tc>
@@ -1159,7 +1247,7 @@
         <w:pStyle w:val="ListBullet"/>
       </w:pPr>
       <w:r>
-        <w:t>Nếu đang chạm đáy: không tích giờ rơi; giữ S thì khóa ngay; không thì cộng lock_timer, đủ 0.5s (LOCK_DELAY) thì khóa + spawn khối mới.</w:t>
+        <w:t>Nếu đang chạm đáy: không tích giờ rơi; nếu người chơi giữ phím rơi nhanh thì khóa ngay; không thì cộng lock_timer, đủ 0.5s (LOCK_DELAY) thì khóa + spawn khối mới.</w:t>
       </w:r>
     </w:p>
     <w:p>
@@ -1167,7 +1255,7 @@
         <w:pStyle w:val="ListBullet"/>
       </w:pPr>
       <w:r>
-        <w:t>Nếu đang lơ lửng: reset đồng hồ khóa; tích fall_timer; đủ interval (0.05s khi giữ S, còn lại theo speed) thì xuống 1 ô. Trừ interval giữ phần dư để tốc độ chuẩn khi FPS trồi sụt.</w:t>
+        <w:t>Nếu đang lơ lửng: reset đồng hồ khóa; tích fall_timer; đủ interval (0.05s khi giữ phím rơi nhanh, còn lại theo speed) thì xuống 1 ô. Trừ interval giữ phần dư để tốc độ chuẩn khi FPS trồi sụt.</w:t>
       </w:r>
     </w:p>
     <w:p>
@@ -1298,7 +1386,7 @@
           </w:tcPr>
           <w:p>
             <w:r>
-              <w:t>Trả về ('need_2p') nếu chọn 2 người; ('goto_diff') để sang màn hình độ khó; ('start_1p', key) với key easy/medium/hard khi chọn độ khó xong</w:t>
+              <w:t>Chọn chế độ xong → sang màn hình độ khó; chọn độ khó xong trả về ('start_1p', key) hoặc ('start_2p', key) với key easy/medium/hard</w:t>
             </w:r>
           </w:p>
         </w:tc>
@@ -1359,7 +1447,7 @@
     </w:p>
     <w:p>
       <w:r>
-        <w:t>Khởi tạo pygame, cửa sổ 500×600, 2 cỡ chữ, 1 Menu + 1 Board, biến state ('menu' / 'playing' / 'wip_2p') và cờ paused.</w:t>
+        <w:t>Khởi tạo pygame, cửa sổ 1P 500×600 (2P tự đổi thành 1000×600), 2 cỡ chữ, 1 Menu, 1 Board (1P) hoặc 2 Board (2P), biến state ('menu' / 'playing' / 'playing_2p') và cờ paused.</w:t>
       </w:r>
     </w:p>
     <w:tbl>
@@ -1420,7 +1508,7 @@
           </w:tcPr>
           <w:p>
             <w:r>
-              <w:t>Tạo Board mới đúng độ khó đã chọn, chuyển sang playing</w:t>
+              <w:t>Tạo Board mới đúng độ khó, đặt lại cửa sổ 1P, chuyển sang playing</w:t>
             </w:r>
           </w:p>
         </w:tc>
@@ -1432,7 +1520,7 @@
           </w:tcPr>
           <w:p>
             <w:r>
-              <w:t>reset_hold_timers()</w:t>
+              <w:t>start_2p(diff)</w:t>
             </w:r>
           </w:p>
         </w:tc>
@@ -1442,7 +1530,7 @@
           </w:tcPr>
           <w:p>
             <w:r>
-              <w:t>Reset đồng hồ giữ phím khi đổi trạng thái để không bị trôi phím</w:t>
+              <w:t>Cửa sổ 1000×600, tạo SharedSequence mới + 2 Board cùng độ khó</w:t>
             </w:r>
           </w:p>
         </w:tc>
@@ -1454,7 +1542,7 @@
           </w:tcPr>
           <w:p>
             <w:r>
-              <w:t>Xử lý menu</w:t>
+              <w:t>reset_hold_timers(i)</w:t>
             </w:r>
           </w:p>
         </w:tc>
@@ -1464,7 +1552,7 @@
           </w:tcPr>
           <w:p>
             <w:r>
-              <w:t>W/S hoặc Up/Down di chuyển, Space/Enter chọn, ESC lùi; chọn 2P sang màn hình chờ</w:t>
+              <w:t>Reset đồng hồ giữ phím của người chơi i khi đổi trạng thái</w:t>
             </w:r>
           </w:p>
         </w:tc>
@@ -1476,7 +1564,7 @@
           </w:tcPr>
           <w:p>
             <w:r>
-              <w:t>Xử lý game</w:t>
+              <w:t>move_hold(b, keys, keyset, timers, dt)</w:t>
             </w:r>
           </w:p>
         </w:tc>
@@ -1486,7 +1574,7 @@
           </w:tcPr>
           <w:p>
             <w:r>
-              <w:t>W xoay, Space hard-drop (A/D không ở đây mà ở phần giữ phím); P pause, R chơi lại khi thua, ESC về menu</w:t>
+              <w:t>Giữ trái/phải đi liên tục kiểu DAS: frame đầu đi ngay 1 ô, giữ quá 0.18s thì mỗi 0.06s đi thêm 1 ô; giữ cả 2 phím thì đứng yên</w:t>
             </w:r>
           </w:p>
         </w:tc>
@@ -1498,7 +1586,7 @@
           </w:tcPr>
           <w:p>
             <w:r>
-              <w:t>Giữ A/D (DAS)</w:t>
+              <w:t>P2P_KEYS</w:t>
             </w:r>
           </w:p>
         </w:tc>
@@ -1508,7 +1596,7 @@
           </w:tcPr>
           <w:p>
             <w:r>
-              <w:t>Frame đầu đi ngay 1 ô; giữ quá 0.18s thì mỗi 0.06s đi thêm 1 ô; giữ cả 2 phím thì đứng yên</w:t>
+              <w:t>Bộ phím 2P: P1 = A/D/W/S + Space; P2 = mũi tên + Enter</w:t>
             </w:r>
           </w:p>
         </w:tc>
@@ -1520,7 +1608,7 @@
           </w:tcPr>
           <w:p>
             <w:r>
-              <w:t>Vẽ playing</w:t>
+              <w:t>Xử lý playing (1P)</w:t>
             </w:r>
           </w:p>
         </w:tc>
@@ -1530,7 +1618,73 @@
           </w:tcPr>
           <w:p>
             <w:r>
-              <w:t>board.draw() + dòng hướng dẫn phím; pause hiện PAUSE; thua làm mờ board rồi hiện GAME OVER + Score/Best + nhắc R chơi lại</w:t>
+              <w:t>W xoay, Space hard-drop; P pause, R chơi lại khi thua, ESC về menu</w:t>
+            </w:r>
+          </w:p>
+        </w:tc>
+      </w:tr>
+      <w:tr>
+        <w:tc>
+          <w:tcPr>
+            <w:tcW w:type="dxa" w:w="4320"/>
+          </w:tcPr>
+          <w:p>
+            <w:r>
+              <w:t>Xử lý playing_2p</w:t>
+            </w:r>
+          </w:p>
+        </w:tc>
+        <w:tc>
+          <w:tcPr>
+            <w:tcW w:type="dxa" w:w="4320"/>
+          </w:tcPr>
+          <w:p>
+            <w:r>
+              <w:t>Xoay/roi ngay theo bộ phím riêng từng người; P pause; khi 1 bên thua thì dừng trận, R chơi lại cùng độ khó (rematch), ESC về menu</w:t>
+            </w:r>
+          </w:p>
+        </w:tc>
+      </w:tr>
+      <w:tr>
+        <w:tc>
+          <w:tcPr>
+            <w:tcW w:type="dxa" w:w="4320"/>
+          </w:tcPr>
+          <w:p>
+            <w:r>
+              <w:t>draw_2p_overlay()</w:t>
+            </w:r>
+          </w:p>
+        </w:tc>
+        <w:tc>
+          <w:tcPr>
+            <w:tcW w:type="dxa" w:w="4320"/>
+          </w:tcPr>
+          <w:p>
+            <w:r>
+              <w:t>Làm mờ 2 board, hiện 'Px THANG!' + điểm 2 bên + nhắc R chơi lại</w:t>
+            </w:r>
+          </w:p>
+        </w:tc>
+      </w:tr>
+      <w:tr>
+        <w:tc>
+          <w:tcPr>
+            <w:tcW w:type="dxa" w:w="4320"/>
+          </w:tcPr>
+          <w:p>
+            <w:r>
+              <w:t>Vẽ 2P</w:t>
+            </w:r>
+          </w:p>
+        </w:tc>
+        <w:tc>
+          <w:tcPr>
+            <w:tcW w:type="dxa" w:w="4320"/>
+          </w:tcPr>
+          <w:p>
+            <w:r>
+              <w:t>Hai board cạnh nhau ngăn bằng vạch dọc, nhãn P1/P2 ở mỗi panel</w:t>
             </w:r>
           </w:p>
         </w:tc>
@@ -1550,7 +1704,7 @@
         <w:pStyle w:val="ListBullet"/>
       </w:pPr>
       <w:r>
-        <w:t>1. _spawn() lấy loại khối thứ spawn_count từ chuỗi chung, căn giữa, hiện ở đỉnh.</w:t>
+        <w:t>1. _spawn() lấy khối tại vị trí (base + piece_count) từ chuỗi chung, căn giữa, hiện ở đỉnh.</w:t>
       </w:r>
     </w:p>
     <w:p>
@@ -1558,7 +1712,7 @@
         <w:pStyle w:val="ListBullet"/>
       </w:pPr>
       <w:r>
-        <w:t>2. Mỗi frame update(dt): chưa chạm đáy thì rơi theo tốc độ; giữ S rơi 0.05s/ô.</w:t>
+        <w:t>2. Mỗi frame update(dt): chưa chạm đáy thì rơi theo tốc độ; giữ phím rơi nhanh thì 0.05s/ô.</w:t>
       </w:r>
     </w:p>
     <w:p>
@@ -1566,7 +1720,7 @@
         <w:pStyle w:val="ListBullet"/>
       </w:pPr>
       <w:r>
-        <w:t>3. Người chơi dùng A/D đi, W xoay (wall-kick tự dịch chuyển nếu kẹt).</w:t>
+        <w:t>3. Người chơi đi trái/phải, xoay (wall-kick tự dịch chuyển nếu kẹt).</w:t>
       </w:r>
     </w:p>
     <w:p>
@@ -1582,7 +1736,7 @@
         <w:pStyle w:val="ListBullet"/>
       </w:pPr>
       <w:r>
-        <w:t>5. Hết giờ (hoặc Space hard-drop): lock() tô màu lên grid → clear_lines() ăn hàng + điểm.</w:t>
+        <w:t>5. Hết giờ (hoặc hard-drop): lock() tô màu lên grid → clear_lines() ăn hàng + điểm.</w:t>
       </w:r>
     </w:p>
     <w:p>
@@ -1590,7 +1744,7 @@
         <w:pStyle w:val="ListBullet"/>
       </w:pPr>
       <w:r>
-        <w:t>6. _spawn() khối mới; nếu đè lên gạch cũ → game_over, chốt kỷ lục, màn hình thua hiện điểm + Best, nhấn R chơi ván mới.</w:t>
+        <w:t>6. _spawn() khối mới; nếu đè lên gạch cũ → game_over. 1P: màn hình thua + R chơi lại. 2P: hiện Px THANG! + R rematch.</w:t>
       </w:r>
     </w:p>
     <w:p>
@@ -1598,7 +1752,7 @@
         <w:pStyle w:val="Heading1"/>
       </w:pPr>
       <w:r>
-        <w:t>8. Bảng phím điều khiển (1P)</w:t>
+        <w:t>8. Bảng phím điều khiển</w:t>
       </w:r>
     </w:p>
     <w:tbl>
@@ -1609,13 +1763,28 @@
         <w:tblLook w:firstColumn="1" w:firstRow="1" w:lastColumn="0" w:lastRow="0" w:noHBand="0" w:noVBand="1" w:val="04A0"/>
       </w:tblPr>
       <w:tblGrid>
-        <w:gridCol w:w="4320"/>
-        <w:gridCol w:w="4320"/>
+        <w:gridCol w:w="2880"/>
+        <w:gridCol w:w="2880"/>
+        <w:gridCol w:w="2880"/>
       </w:tblGrid>
       <w:tr>
         <w:tc>
           <w:tcPr>
-            <w:tcW w:type="dxa" w:w="4320"/>
+            <w:tcW w:type="dxa" w:w="2880"/>
+          </w:tcPr>
+          <w:p>
+            <w:r/>
+            <w:r>
+              <w:rPr>
+                <w:b/>
+              </w:rPr>
+              <w:t>Chế độ</w:t>
+            </w:r>
+          </w:p>
+        </w:tc>
+        <w:tc>
+          <w:tcPr>
+            <w:tcW w:type="dxa" w:w="2880"/>
           </w:tcPr>
           <w:p>
             <w:r/>
@@ -1629,7 +1798,7 @@
         </w:tc>
         <w:tc>
           <w:tcPr>
-            <w:tcW w:type="dxa" w:w="4320"/>
+            <w:tcW w:type="dxa" w:w="2880"/>
           </w:tcPr>
           <w:p>
             <w:r/>
@@ -1645,7 +1814,17 @@
       <w:tr>
         <w:tc>
           <w:tcPr>
-            <w:tcW w:type="dxa" w:w="4320"/>
+            <w:tcW w:type="dxa" w:w="2880"/>
+          </w:tcPr>
+          <w:p>
+            <w:r>
+              <w:t>1P</w:t>
+            </w:r>
+          </w:p>
+        </w:tc>
+        <w:tc>
+          <w:tcPr>
+            <w:tcW w:type="dxa" w:w="2880"/>
           </w:tcPr>
           <w:p>
             <w:r>
@@ -1655,11 +1834,11 @@
         </w:tc>
         <w:tc>
           <w:tcPr>
-            <w:tcW w:type="dxa" w:w="4320"/>
+            <w:tcW w:type="dxa" w:w="2880"/>
           </w:tcPr>
           <w:p>
             <w:r>
-              <w:t>Trái / phải từng ô; giữ để đi liên tục</w:t>
+              <w:t>Trái / phải, giữ để đi liên tục</w:t>
             </w:r>
           </w:p>
         </w:tc>
@@ -1667,7 +1846,17 @@
       <w:tr>
         <w:tc>
           <w:tcPr>
-            <w:tcW w:type="dxa" w:w="4320"/>
+            <w:tcW w:type="dxa" w:w="2880"/>
+          </w:tcPr>
+          <w:p>
+            <w:r>
+              <w:t>1P</w:t>
+            </w:r>
+          </w:p>
+        </w:tc>
+        <w:tc>
+          <w:tcPr>
+            <w:tcW w:type="dxa" w:w="2880"/>
           </w:tcPr>
           <w:p>
             <w:r>
@@ -1677,7 +1866,7 @@
         </w:tc>
         <w:tc>
           <w:tcPr>
-            <w:tcW w:type="dxa" w:w="4320"/>
+            <w:tcW w:type="dxa" w:w="2880"/>
           </w:tcPr>
           <w:p>
             <w:r>
@@ -1689,7 +1878,17 @@
       <w:tr>
         <w:tc>
           <w:tcPr>
-            <w:tcW w:type="dxa" w:w="4320"/>
+            <w:tcW w:type="dxa" w:w="2880"/>
+          </w:tcPr>
+          <w:p>
+            <w:r>
+              <w:t>1P</w:t>
+            </w:r>
+          </w:p>
+        </w:tc>
+        <w:tc>
+          <w:tcPr>
+            <w:tcW w:type="dxa" w:w="2880"/>
           </w:tcPr>
           <w:p>
             <w:r>
@@ -1699,7 +1898,7 @@
         </w:tc>
         <w:tc>
           <w:tcPr>
-            <w:tcW w:type="dxa" w:w="4320"/>
+            <w:tcW w:type="dxa" w:w="2880"/>
           </w:tcPr>
           <w:p>
             <w:r>
@@ -1711,7 +1910,17 @@
       <w:tr>
         <w:tc>
           <w:tcPr>
-            <w:tcW w:type="dxa" w:w="4320"/>
+            <w:tcW w:type="dxa" w:w="2880"/>
+          </w:tcPr>
+          <w:p>
+            <w:r>
+              <w:t>1P</w:t>
+            </w:r>
+          </w:p>
+        </w:tc>
+        <w:tc>
+          <w:tcPr>
+            <w:tcW w:type="dxa" w:w="2880"/>
           </w:tcPr>
           <w:p>
             <w:r>
@@ -1721,7 +1930,7 @@
         </w:tc>
         <w:tc>
           <w:tcPr>
-            <w:tcW w:type="dxa" w:w="4320"/>
+            <w:tcW w:type="dxa" w:w="2880"/>
           </w:tcPr>
           <w:p>
             <w:r>
@@ -1733,7 +1942,81 @@
       <w:tr>
         <w:tc>
           <w:tcPr>
-            <w:tcW w:type="dxa" w:w="4320"/>
+            <w:tcW w:type="dxa" w:w="2880"/>
+          </w:tcPr>
+          <w:p>
+            <w:r>
+              <w:t>2P – P1</w:t>
+            </w:r>
+          </w:p>
+        </w:tc>
+        <w:tc>
+          <w:tcPr>
+            <w:tcW w:type="dxa" w:w="2880"/>
+          </w:tcPr>
+          <w:p>
+            <w:r>
+              <w:t>A / D / W / S / Space</w:t>
+            </w:r>
+          </w:p>
+        </w:tc>
+        <w:tc>
+          <w:tcPr>
+            <w:tcW w:type="dxa" w:w="2880"/>
+          </w:tcPr>
+          <w:p>
+            <w:r>
+              <w:t>Trái / phải / xoay / rơi nhanh / rơi ngay</w:t>
+            </w:r>
+          </w:p>
+        </w:tc>
+      </w:tr>
+      <w:tr>
+        <w:tc>
+          <w:tcPr>
+            <w:tcW w:type="dxa" w:w="2880"/>
+          </w:tcPr>
+          <w:p>
+            <w:r>
+              <w:t>2P – P2</w:t>
+            </w:r>
+          </w:p>
+        </w:tc>
+        <w:tc>
+          <w:tcPr>
+            <w:tcW w:type="dxa" w:w="2880"/>
+          </w:tcPr>
+          <w:p>
+            <w:r>
+              <w:t>← / → / ↑ / ↓ / Enter</w:t>
+            </w:r>
+          </w:p>
+        </w:tc>
+        <w:tc>
+          <w:tcPr>
+            <w:tcW w:type="dxa" w:w="2880"/>
+          </w:tcPr>
+          <w:p>
+            <w:r>
+              <w:t>Trái / phải / xoay / rơi nhanh / rơi ngay</w:t>
+            </w:r>
+          </w:p>
+        </w:tc>
+      </w:tr>
+      <w:tr>
+        <w:tc>
+          <w:tcPr>
+            <w:tcW w:type="dxa" w:w="2880"/>
+          </w:tcPr>
+          <w:p>
+            <w:r>
+              <w:t>Cả hai</w:t>
+            </w:r>
+          </w:p>
+        </w:tc>
+        <w:tc>
+          <w:tcPr>
+            <w:tcW w:type="dxa" w:w="2880"/>
           </w:tcPr>
           <w:p>
             <w:r>
@@ -1743,7 +2026,7 @@
         </w:tc>
         <w:tc>
           <w:tcPr>
-            <w:tcW w:type="dxa" w:w="4320"/>
+            <w:tcW w:type="dxa" w:w="2880"/>
           </w:tcPr>
           <w:p>
             <w:r>

</xml_diff>

<commit_message>
Sua ket qua 2P: het tran so diem, ai cao hon thang, bang diem hoa
</commit_message>
<xml_diff>
--- a/Giai_thich_code_Tetris.docx
+++ b/Giai_thich_code_Tetris.docx
@@ -8,12 +8,12 @@
         <w:jc w:val="center"/>
       </w:pPr>
       <w:r>
-        <w:t>GIẢI THÍCH CODE GAME TETRIS (PYTHON + PYGAME)</w:t>
+        <w:t>GIẢI THÍCH CODE GAME TETRIS</w:t>
       </w:r>
     </w:p>
     <w:p>
       <w:r>
-        <w:t>Tài liệu mô tả chức năng từng hàm và cách hoạt động của toàn bộ chương trình, gồm 5 file: settings.py, pieces.py, game.py, menu.py, main.py. Lưới chơi 10×20, 7 khối Tetromino, 3 tốc độ rơi, 3 độ khó, chế độ 1 người chơi và 2 người chơi (2 bảng cạnh nhau, dùng chung chuỗi khối để công bằng).</w:t>
+        <w:t>Tài liệu mô tả chức năng từng hàm và cách hoạt động của toàn bộ chương trình, gồm 5 file: settings.py, pieces.py, game.py, menu.py, main.py. Lưới chơi 10×20, 7 khối Tetromino, 3 tốc độ rơi, 3 độ khó, chế độ 1 người chơi và 2 người chơi (2 bảng cạnh nhau, dùng chung chuỗi khối để công bằng; khi cả 2 đều hết chỗ thì ai điểm cao hơn thắng, bằng điểm thì hòa).</w:t>
       </w:r>
     </w:p>
     <w:p>
@@ -217,11 +217,6 @@
       </w:pPr>
       <w:r>
         <w:t>2. settings.py – Cấu hình</w:t>
-      </w:r>
-    </w:p>
-    <w:p>
-      <w:r>
-        <w:t>File này không có hàm, chỉ gồm hằng số. Muốn đổi tốc độ/điểm/màu thì chỉ sửa ở đây.</w:t>
       </w:r>
     </w:p>
     <w:tbl>
@@ -562,24 +557,13 @@
       </w:r>
     </w:p>
     <w:p>
-      <w:pPr>
-        <w:pStyle w:val="Heading2"/>
-      </w:pPr>
       <w:r>
-        <w:t>3.1. SHAPES và COLORS</w:t>
+        <w:t>SHAPES là dict 7 khối I, O, T, S, Z, J, L; mỗi khối là ma trận 0/1 (1 = ô có gạch). COLORS là màu riêng từng loại. Class Piece có rotate() (xoay 90° kim đồng hồ) và cells() (đổi ra danh sách ô trên lưới để vẽ/khóa).</w:t>
       </w:r>
     </w:p>
     <w:p>
       <w:r>
-        <w:t>SHAPES là dict 7 khối I, O, T, S, Z, J, L. Mỗi khối là ma trận 0/1: số 1 là ô có gạch, số 0 là ô trống. Ví dụ khối T có 1 ô giữa ở hàng 1 và 3 ô liền nhau ở hàng 2. COLORS là màu riêng từng loại (I cyan, O vàng, T tím, S xanh lá, Z đỏ, J xanh dương, L cam).</w:t>
-      </w:r>
-    </w:p>
-    <w:p>
-      <w:pPr>
-        <w:pStyle w:val="Heading2"/>
-      </w:pPr>
-      <w:r>
-        <w:t>3.2. Class Piece – 1 khối đang rơi</w:t>
+        <w:t>Class SharedSequence đảm bảo công bằng cho 2P: cả 2 Board cùng trỏ tới 1 SharedSequence. Board thứ k spawn khối bằng consume_to(base + k) — đọc khối ở vị trí đó rồi đẩy con trỏ chung (cursor) qua. Board kia đọc đúng vị trí ấy sẽ nhận đúng khối đó, nên dù ai chơi nhanh chậm thế nào, khối hai bên nhận vẫn giống hệt nhau từng lượt. Bên trong dùng 7-bag: xáo từng túi đủ 7 loại, túi thứ k luôn cho kết quả giống nhau nhờ rng (seed gốc, số túi).</w:t>
       </w:r>
     </w:p>
     <w:tbl>
@@ -604,7 +588,7 @@
               <w:rPr>
                 <w:b/>
               </w:rPr>
-              <w:t>Hàm</w:t>
+              <w:t>Hàm SharedSequence</w:t>
             </w:r>
           </w:p>
         </w:tc>
@@ -619,194 +603,6 @@
                 <w:b/>
               </w:rPr>
               <w:t>Chức năng</w:t>
-            </w:r>
-          </w:p>
-        </w:tc>
-      </w:tr>
-      <w:tr>
-        <w:tc>
-          <w:tcPr>
-            <w:tcW w:type="dxa" w:w="4320"/>
-          </w:tcPr>
-          <w:p>
-            <w:r>
-              <w:t>__init__(kind)</w:t>
-            </w:r>
-          </w:p>
-        </w:tc>
-        <w:tc>
-          <w:tcPr>
-            <w:tcW w:type="dxa" w:w="4320"/>
-          </w:tcPr>
-          <w:p>
-            <w:r>
-              <w:t>Tạo khối: copy ma trận từ SHAPES (để xoay không hỏng mẫu gốc), lấy màu từ COLORS</w:t>
-            </w:r>
-          </w:p>
-        </w:tc>
-      </w:tr>
-      <w:tr>
-        <w:tc>
-          <w:tcPr>
-            <w:tcW w:type="dxa" w:w="4320"/>
-          </w:tcPr>
-          <w:p>
-            <w:r>
-              <w:t>rotate()</w:t>
-            </w:r>
-          </w:p>
-        </w:tc>
-        <w:tc>
-          <w:tcPr>
-            <w:tcW w:type="dxa" w:w="4320"/>
-          </w:tcPr>
-          <w:p>
-            <w:r>
-              <w:t>Xoay ma trận 90° theo chiều kim đồng hồ, trả về ma trận mới (chưa kiểm tra va chạm, Board sẽ check)</w:t>
-            </w:r>
-          </w:p>
-        </w:tc>
-      </w:tr>
-      <w:tr>
-        <w:tc>
-          <w:tcPr>
-            <w:tcW w:type="dxa" w:w="4320"/>
-          </w:tcPr>
-          <w:p>
-            <w:r>
-              <w:t>cells()</w:t>
-            </w:r>
-          </w:p>
-        </w:tc>
-        <w:tc>
-          <w:tcPr>
-            <w:tcW w:type="dxa" w:w="4320"/>
-          </w:tcPr>
-          <w:p>
-            <w:r>
-              <w:t>Đổi ma trận + tọa độ (x, y) thành danh sách các ô (x, y) trên lưới, dùng để vẽ và để khóa khối vào grid</w:t>
-            </w:r>
-          </w:p>
-        </w:tc>
-      </w:tr>
-    </w:tbl>
-    <w:p/>
-    <w:p>
-      <w:pPr>
-        <w:pStyle w:val="Heading2"/>
-      </w:pPr>
-      <w:r>
-        <w:t>3.3. Class SharedSequence – chuỗi khối chung cho 2 người chơi</w:t>
-      </w:r>
-    </w:p>
-    <w:p>
-      <w:r>
-        <w:t>Đảm bảo công bằng: cả 2 Board cùng trỏ tới 1 SharedSequence. Board thứ k spawn khối bằng cách gọi consume_to(base + k) đọc khối tại vị trí đó rồi đẩy con trỏ chung (cursor) qua. Board kia sau này đọc đúng vị trí ấy sẽ nhận đúng khối đó, nên dù ai chơi nhanh chậm thế nào, khối hai bên nhận vẫn giống hệt nhau từng lượt. Bên trong dùng kiểu 7-bag: xáo từng túi đủ 7 loại rồi mới xáo túi tiếp, tránh ra 1 loại liên tục.</w:t>
-      </w:r>
-    </w:p>
-    <w:tbl>
-      <w:tblPr>
-        <w:tblStyle w:val="TableGrid"/>
-        <w:tblW w:type="auto" w:w="0"/>
-        <w:jc w:val="center"/>
-        <w:tblLook w:firstColumn="1" w:firstRow="1" w:lastColumn="0" w:lastRow="0" w:noHBand="0" w:noVBand="1" w:val="04A0"/>
-      </w:tblPr>
-      <w:tblGrid>
-        <w:gridCol w:w="4320"/>
-        <w:gridCol w:w="4320"/>
-      </w:tblGrid>
-      <w:tr>
-        <w:tc>
-          <w:tcPr>
-            <w:tcW w:type="dxa" w:w="4320"/>
-          </w:tcPr>
-          <w:p>
-            <w:r/>
-            <w:r>
-              <w:rPr>
-                <w:b/>
-              </w:rPr>
-              <w:t>Hàm</w:t>
-            </w:r>
-          </w:p>
-        </w:tc>
-        <w:tc>
-          <w:tcPr>
-            <w:tcW w:type="dxa" w:w="4320"/>
-          </w:tcPr>
-          <w:p>
-            <w:r/>
-            <w:r>
-              <w:rPr>
-                <w:b/>
-              </w:rPr>
-              <w:t>Chức năng</w:t>
-            </w:r>
-          </w:p>
-        </w:tc>
-      </w:tr>
-      <w:tr>
-        <w:tc>
-          <w:tcPr>
-            <w:tcW w:type="dxa" w:w="4320"/>
-          </w:tcPr>
-          <w:p>
-            <w:r>
-              <w:t>__init__(seed)</w:t>
-            </w:r>
-          </w:p>
-        </w:tc>
-        <w:tc>
-          <w:tcPr>
-            <w:tcW w:type="dxa" w:w="4320"/>
-          </w:tcPr>
-          <w:p>
-            <w:r>
-              <w:t>Seed gốc để sinh seed riêng cho từng túi; seed None thì random mỗi ván</w:t>
-            </w:r>
-          </w:p>
-        </w:tc>
-      </w:tr>
-      <w:tr>
-        <w:tc>
-          <w:tcPr>
-            <w:tcW w:type="dxa" w:w="4320"/>
-          </w:tcPr>
-          <w:p>
-            <w:r>
-              <w:t>_ensure(i)</w:t>
-            </w:r>
-          </w:p>
-        </w:tc>
-        <w:tc>
-          <w:tcPr>
-            <w:tcW w:type="dxa" w:w="4320"/>
-          </w:tcPr>
-          <w:p>
-            <w:r>
-              <w:t>Đảm bảo chuỗi đã xáo đủ dài tới vị trí i</w:t>
-            </w:r>
-          </w:p>
-        </w:tc>
-      </w:tr>
-      <w:tr>
-        <w:tc>
-          <w:tcPr>
-            <w:tcW w:type="dxa" w:w="4320"/>
-          </w:tcPr>
-          <w:p>
-            <w:r>
-              <w:t>_fill_bag(bag_index)</w:t>
-            </w:r>
-          </w:p>
-        </w:tc>
-        <w:tc>
-          <w:tcPr>
-            <w:tcW w:type="dxa" w:w="4320"/>
-          </w:tcPr>
-          <w:p>
-            <w:r>
-              <w:t>Xáo 1 túi 7 khối từ rng (seed gốc, số túi) — túi thứ k luôn giống nhau</w:t>
             </w:r>
           </w:p>
         </w:tc>
@@ -850,7 +646,7 @@
           </w:tcPr>
           <w:p>
             <w:r>
-              <w:t>Tiêu thụ khối ở vị trí i: đọc khối và đẩy con trỏ chung lên i+1</w:t>
+              <w:t>Đọc khối ở vị trí i và đẩy con trỏ chung lên i+1</w:t>
             </w:r>
           </w:p>
         </w:tc>
@@ -862,12 +658,12 @@
         <w:pStyle w:val="Heading1"/>
       </w:pPr>
       <w:r>
-        <w:t>4. game.py – Class Board (logic 1 bảng chơi)</w:t>
+        <w:t>4. game.py – Class Board</w:t>
       </w:r>
     </w:p>
     <w:p>
       <w:r>
-        <w:t>Board giữ: grid (lưới màu, ô BLACK là trống), current (khối đang rơi), next_kind (khối kế tiếp), score/lines, speed_level, fall_timer/lock_timer, game_over, high (kỷ lục), base_piece (mốc bắt đầu ván trong chuỗi chung), piece_count (số khối đã spawn).</w:t>
+        <w:t>Board giữ: grid (lưới màu), current (khối đang rơi), next_kind (khối kế tiếp), score/lines, speed_level, fall_timer/lock_timer, game_over, high (kỷ lục), base_piece (mốc bắt đầu ván trong chuỗi chung), piece_count (số khối đã spawn).</w:t>
       </w:r>
     </w:p>
     <w:tbl>
@@ -972,7 +768,7 @@
           </w:tcPr>
           <w:p>
             <w:r>
-              <w:t>Kiểm tra vị trí hợp lệ: vượt biên trái/phải/đáy hoặc đè lên ô đã khóa → False; cho phép y &lt; 0 (khối mới nhú ở mép trên)</w:t>
+              <w:t>Kiểm tra vị trí hợp lệ (biên + ô đã khóa); cho phép y &lt; 0 (khối nhú mép trên)</w:t>
             </w:r>
           </w:p>
         </w:tc>
@@ -994,7 +790,7 @@
           </w:tcPr>
           <w:p>
             <w:r>
-              <w:t>True khi khối chạm đáy/nóc đống gạch (không xuống được nữa)</w:t>
+              <w:t>True khi khối chạm đáy/nóc đống gạch</w:t>
             </w:r>
           </w:p>
         </w:tc>
@@ -1016,7 +812,7 @@
           </w:tcPr>
           <w:p>
             <w:r>
-              <w:t>Tô màu từng ô của khối lên grid, rồi gọi clear_lines() ăn hàng ngay</w:t>
+              <w:t>Tô màu khối lên grid rồi gọi clear_lines()</w:t>
             </w:r>
           </w:p>
         </w:tc>
@@ -1038,7 +834,7 @@
           </w:tcPr>
           <w:p>
             <w:r>
-              <w:t>Tìm hàng kín full, xóa + chèn hàng trống lên đầu; cộng điểm theo bảng LINE_SCORES nhân speed; đếm lines; cập nhật kỷ lục + lưu file; gọi lên tốc</w:t>
+              <w:t>Xóa hàng kín, cộng điểm theo LINE_SCORES × speed, cập nhật kỷ lục, lên tốc</w:t>
             </w:r>
           </w:p>
         </w:tc>
@@ -1050,7 +846,7 @@
           </w:tcPr>
           <w:p>
             <w:r>
-              <w:t>maybe_speed_up()</w:t>
+              <w:t>try_move(dx) / try_rotate()</w:t>
             </w:r>
           </w:p>
         </w:tc>
@@ -1060,73 +856,7 @@
           </w:tcPr>
           <w:p>
             <w:r>
-              <w:t>Đủ 1500 điểm mà chưa tới tốc độ tối đa thì lên 1 cấp</w:t>
-            </w:r>
-          </w:p>
-        </w:tc>
-      </w:tr>
-      <w:tr>
-        <w:tc>
-          <w:tcPr>
-            <w:tcW w:type="dxa" w:w="4320"/>
-          </w:tcPr>
-          <w:p>
-            <w:r>
-              <w:t>try_move(dx)</w:t>
-            </w:r>
-          </w:p>
-        </w:tc>
-        <w:tc>
-          <w:tcPr>
-            <w:tcW w:type="dxa" w:w="4320"/>
-          </w:tcPr>
-          <w:p>
-            <w:r>
-              <w:t>Dịch ngang nếu hợp lệ (−1 trái, +1 phải); thành công lúc chạm đáy thì gia hạn lock</w:t>
-            </w:r>
-          </w:p>
-        </w:tc>
-      </w:tr>
-      <w:tr>
-        <w:tc>
-          <w:tcPr>
-            <w:tcW w:type="dxa" w:w="4320"/>
-          </w:tcPr>
-          <w:p>
-            <w:r>
-              <w:t>try_rotate()</w:t>
-            </w:r>
-          </w:p>
-        </w:tc>
-        <w:tc>
-          <w:tcPr>
-            <w:tcW w:type="dxa" w:w="4320"/>
-          </w:tcPr>
-          <w:p>
-            <w:r>
-              <w:t>Xoay + wall-kick thử (0, −1, +1, −2, +2); cái nào hợp lệ thì lấy (±2 để cứu thanh I kẹt sát tường)</w:t>
-            </w:r>
-          </w:p>
-        </w:tc>
-      </w:tr>
-      <w:tr>
-        <w:tc>
-          <w:tcPr>
-            <w:tcW w:type="dxa" w:w="4320"/>
-          </w:tcPr>
-          <w:p>
-            <w:r>
-              <w:t>_bump_lock_delay()</w:t>
-            </w:r>
-          </w:p>
-        </w:tc>
-        <w:tc>
-          <w:tcPr>
-            <w:tcW w:type="dxa" w:w="4320"/>
-          </w:tcPr>
-          <w:p>
-            <w:r>
-              <w:t>Gia hạn giờ khóa sau đi/xoay thành công lúc chạm đáy (tối đa 15 lần)</w:t>
+              <w:t>Dịch ngang / xoay kèm wall-kick (0, ±1, ±2); thành công lúc chạm đáy thì gia hạn lock delay</w:t>
             </w:r>
           </w:p>
         </w:tc>
@@ -1148,7 +878,7 @@
           </w:tcPr>
           <w:p>
             <w:r>
-              <w:t>Cho khối xuống tận đáy rồi khóa + spawn khối mới ngay</w:t>
+              <w:t>Xuống tận đáy rồi khóa + spawn khối mới ngay</w:t>
             </w:r>
           </w:p>
         </w:tc>
@@ -1170,7 +900,7 @@
           </w:tcPr>
           <w:p>
             <w:r>
-              <w:t>Gọi mỗi frame (xem mục 4.1)</w:t>
+              <w:t>Mỗi frame: chạm đáy thì đếm lock 0.5s (hoặc khóa ngay nếu giữ phím rơi nhanh); lơ lửng thì rơi theo tốc độ; trừ interval giữ phần dư để tốc độ chuẩn</w:t>
             </w:r>
           </w:p>
         </w:tc>
@@ -1192,245 +922,7 @@
           </w:tcPr>
           <w:p>
             <w:r>
-              <w:t>Vẽ lưới + khối đang rơi + panel: khung next, SCORE, LINES, HI, Speed</w:t>
-            </w:r>
-          </w:p>
-        </w:tc>
-      </w:tr>
-      <w:tr>
-        <w:tc>
-          <w:tcPr>
-            <w:tcW w:type="dxa" w:w="4320"/>
-          </w:tcPr>
-          <w:p>
-            <w:r>
-              <w:t>load/save_highscore()</w:t>
-            </w:r>
-          </w:p>
-        </w:tc>
-        <w:tc>
-          <w:tcPr>
-            <w:tcW w:type="dxa" w:w="4320"/>
-          </w:tcPr>
-          <w:p>
-            <w:r>
-              <w:t>Đọc/ghi kỷ lục ra highscore.txt, lỗi file thì bỏ qua</w:t>
-            </w:r>
-          </w:p>
-        </w:tc>
-      </w:tr>
-    </w:tbl>
-    <w:p/>
-    <w:p>
-      <w:pPr>
-        <w:pStyle w:val="Heading2"/>
-      </w:pPr>
-      <w:r>
-        <w:t>4.1. Hàm update() – trái tim của game</w:t>
-      </w:r>
-    </w:p>
-    <w:p>
-      <w:r>
-        <w:t>Mỗi frame main.py gọi board.update(dt) với dt là số giây từ frame trước:</w:t>
-      </w:r>
-    </w:p>
-    <w:p>
-      <w:pPr>
-        <w:pStyle w:val="ListBullet"/>
-      </w:pPr>
-      <w:r>
-        <w:t>Nếu game_over thì dừng hẳn, không làm gì.</w:t>
-      </w:r>
-    </w:p>
-    <w:p>
-      <w:pPr>
-        <w:pStyle w:val="ListBullet"/>
-      </w:pPr>
-      <w:r>
-        <w:t>Nếu đang chạm đáy: không tích giờ rơi; nếu người chơi giữ phím rơi nhanh thì khóa ngay; không thì cộng lock_timer, đủ 0.5s (LOCK_DELAY) thì khóa + spawn khối mới.</w:t>
-      </w:r>
-    </w:p>
-    <w:p>
-      <w:pPr>
-        <w:pStyle w:val="ListBullet"/>
-      </w:pPr>
-      <w:r>
-        <w:t>Nếu đang lơ lửng: reset đồng hồ khóa; tích fall_timer; đủ interval (0.05s khi giữ phím rơi nhanh, còn lại theo speed) thì xuống 1 ô. Trừ interval giữ phần dư để tốc độ chuẩn khi FPS trồi sụt.</w:t>
-      </w:r>
-    </w:p>
-    <w:p>
-      <w:pPr>
-        <w:pStyle w:val="Heading2"/>
-      </w:pPr>
-      <w:r>
-        <w:t>4.2. Ví dụ tính điểm</w:t>
-      </w:r>
-    </w:p>
-    <w:p>
-      <w:r>
-        <w:t>Xóa 4 hàng cùng lúc (Tetris) ở speed 2 được 800 × 2 = 1600 điểm, tổng lines +4. Vì 1600 ≥ 1500 ngưỡng lên tốc nên Dễ sẽ lên speed 2 (Trung bình lên speed 3, Khó giữ speed 3).</w:t>
-      </w:r>
-    </w:p>
-    <w:p>
-      <w:pPr>
-        <w:pStyle w:val="Heading1"/>
-      </w:pPr>
-      <w:r>
-        <w:t>5. menu.py – Màn hình chọn</w:t>
-      </w:r>
-    </w:p>
-    <w:p>
-      <w:r>
-        <w:t>Menu đi từ stage mode (chọn 1P/2P) sang stage diff (chọn Dễ/TB/Khó). Trong code dùng tiếng Việt không dấu vì font pygame cơ bản thiếu chữ có dấu.</w:t>
-      </w:r>
-    </w:p>
-    <w:tbl>
-      <w:tblPr>
-        <w:tblStyle w:val="TableGrid"/>
-        <w:tblW w:type="auto" w:w="0"/>
-        <w:jc w:val="center"/>
-        <w:tblLook w:firstColumn="1" w:firstRow="1" w:lastColumn="0" w:lastRow="0" w:noHBand="0" w:noVBand="1" w:val="04A0"/>
-      </w:tblPr>
-      <w:tblGrid>
-        <w:gridCol w:w="4320"/>
-        <w:gridCol w:w="4320"/>
-      </w:tblGrid>
-      <w:tr>
-        <w:tc>
-          <w:tcPr>
-            <w:tcW w:type="dxa" w:w="4320"/>
-          </w:tcPr>
-          <w:p>
-            <w:r/>
-            <w:r>
-              <w:rPr>
-                <w:b/>
-              </w:rPr>
-              <w:t>Hàm</w:t>
-            </w:r>
-          </w:p>
-        </w:tc>
-        <w:tc>
-          <w:tcPr>
-            <w:tcW w:type="dxa" w:w="4320"/>
-          </w:tcPr>
-          <w:p>
-            <w:r/>
-            <w:r>
-              <w:rPr>
-                <w:b/>
-              </w:rPr>
-              <w:t>Chức năng</w:t>
-            </w:r>
-          </w:p>
-        </w:tc>
-      </w:tr>
-      <w:tr>
-        <w:tc>
-          <w:tcPr>
-            <w:tcW w:type="dxa" w:w="4320"/>
-          </w:tcPr>
-          <w:p>
-            <w:r>
-              <w:t>reset()</w:t>
-            </w:r>
-          </w:p>
-        </w:tc>
-        <w:tc>
-          <w:tcPr>
-            <w:tcW w:type="dxa" w:w="4320"/>
-          </w:tcPr>
-          <w:p>
-            <w:r>
-              <w:t>Về lại từ đầu (khi bấm ESC từ game về menu)</w:t>
-            </w:r>
-          </w:p>
-        </w:tc>
-      </w:tr>
-      <w:tr>
-        <w:tc>
-          <w:tcPr>
-            <w:tcW w:type="dxa" w:w="4320"/>
-          </w:tcPr>
-          <w:p>
-            <w:r>
-              <w:t>move(d)</w:t>
-            </w:r>
-          </w:p>
-        </w:tc>
-        <w:tc>
-          <w:tcPr>
-            <w:tcW w:type="dxa" w:w="4320"/>
-          </w:tcPr>
-          <w:p>
-            <w:r>
-              <w:t>Lên (−1) / xuống (+1) mục chọn, vòng tròn qua cuối về đầu</w:t>
-            </w:r>
-          </w:p>
-        </w:tc>
-      </w:tr>
-      <w:tr>
-        <w:tc>
-          <w:tcPr>
-            <w:tcW w:type="dxa" w:w="4320"/>
-          </w:tcPr>
-          <w:p>
-            <w:r>
-              <w:t>confirm()</w:t>
-            </w:r>
-          </w:p>
-        </w:tc>
-        <w:tc>
-          <w:tcPr>
-            <w:tcW w:type="dxa" w:w="4320"/>
-          </w:tcPr>
-          <w:p>
-            <w:r>
-              <w:t>Chọn chế độ xong → sang màn hình độ khó; chọn độ khó xong trả về ('start_1p', key) hoặc ('start_2p', key) với key easy/medium/hard</w:t>
-            </w:r>
-          </w:p>
-        </w:tc>
-      </w:tr>
-      <w:tr>
-        <w:tc>
-          <w:tcPr>
-            <w:tcW w:type="dxa" w:w="4320"/>
-          </w:tcPr>
-          <w:p>
-            <w:r>
-              <w:t>back()</w:t>
-            </w:r>
-          </w:p>
-        </w:tc>
-        <w:tc>
-          <w:tcPr>
-            <w:tcW w:type="dxa" w:w="4320"/>
-          </w:tcPr>
-          <w:p>
-            <w:r>
-              <w:t>ESC từ màn hình độ khó lùi về màn hình chế độ</w:t>
-            </w:r>
-          </w:p>
-        </w:tc>
-      </w:tr>
-      <w:tr>
-        <w:tc>
-          <w:tcPr>
-            <w:tcW w:type="dxa" w:w="4320"/>
-          </w:tcPr>
-          <w:p>
-            <w:r>
-              <w:t>draw(...)</w:t>
-            </w:r>
-          </w:p>
-        </w:tc>
-        <w:tc>
-          <w:tcPr>
-            <w:tcW w:type="dxa" w:w="4320"/>
-          </w:tcPr>
-          <w:p>
-            <w:r>
-              <w:t>Vẽ chữ TETRIS + danh sách lựa chọn, mục đang chọn có dấu '&gt;', kèm dòng hướng dẫn phím</w:t>
+              <w:t>Vẽ lưới + khối + panel: khung next, SCORE, LINES, HI, Speed</w:t>
             </w:r>
           </w:p>
         </w:tc>
@@ -1442,12 +934,20 @@
         <w:pStyle w:val="Heading1"/>
       </w:pPr>
       <w:r>
-        <w:t>6. main.py – Vòng lặp chính</w:t>
+        <w:t>5. menu.py – Màn hình chọn</w:t>
       </w:r>
     </w:p>
     <w:p>
       <w:r>
-        <w:t>Khởi tạo pygame, cửa sổ 1P 500×600 (2P tự đổi thành 1000×600), 2 cỡ chữ, 1 Menu, 1 Board (1P) hoặc 2 Board (2P), biến state ('menu' / 'playing' / 'playing_2p') và cờ paused.</w:t>
+        <w:t>Menu đi từ stage mode (chọn 1P/2P) sang stage diff (chọn Dễ/TB/Khó). confirm() trả về ('start_1p', key) hoặc ('start_2p', key) với key easy/medium/hard; back() để ESC quay lui.</w:t>
+      </w:r>
+    </w:p>
+    <w:p>
+      <w:pPr>
+        <w:pStyle w:val="Heading1"/>
+      </w:pPr>
+      <w:r>
+        <w:t>6. main.py – Vòng lặp chính</w:t>
       </w:r>
     </w:p>
     <w:tbl>
@@ -1498,7 +998,7 @@
           </w:tcPr>
           <w:p>
             <w:r>
-              <w:t>start_1p(diff)</w:t>
+              <w:t>start_1p(diff) / start_2p(diff)</w:t>
             </w:r>
           </w:p>
         </w:tc>
@@ -1508,7 +1008,7 @@
           </w:tcPr>
           <w:p>
             <w:r>
-              <w:t>Tạo Board mới đúng độ khó, đặt lại cửa sổ 1P, chuyển sang playing</w:t>
+              <w:t>Tạo board mới đúng độ khó; 2P mở cửa sổ 1000×600 + tạo SharedSequence + 2 Board cùng độ khó</w:t>
             </w:r>
           </w:p>
         </w:tc>
@@ -1520,7 +1020,7 @@
           </w:tcPr>
           <w:p>
             <w:r>
-              <w:t>start_2p(diff)</w:t>
+              <w:t>move_hold(...)</w:t>
             </w:r>
           </w:p>
         </w:tc>
@@ -1530,51 +1030,7 @@
           </w:tcPr>
           <w:p>
             <w:r>
-              <w:t>Cửa sổ 1000×600, tạo SharedSequence mới + 2 Board cùng độ khó</w:t>
-            </w:r>
-          </w:p>
-        </w:tc>
-      </w:tr>
-      <w:tr>
-        <w:tc>
-          <w:tcPr>
-            <w:tcW w:type="dxa" w:w="4320"/>
-          </w:tcPr>
-          <w:p>
-            <w:r>
-              <w:t>reset_hold_timers(i)</w:t>
-            </w:r>
-          </w:p>
-        </w:tc>
-        <w:tc>
-          <w:tcPr>
-            <w:tcW w:type="dxa" w:w="4320"/>
-          </w:tcPr>
-          <w:p>
-            <w:r>
-              <w:t>Reset đồng hồ giữ phím của người chơi i khi đổi trạng thái</w:t>
-            </w:r>
-          </w:p>
-        </w:tc>
-      </w:tr>
-      <w:tr>
-        <w:tc>
-          <w:tcPr>
-            <w:tcW w:type="dxa" w:w="4320"/>
-          </w:tcPr>
-          <w:p>
-            <w:r>
-              <w:t>move_hold(b, keys, keyset, timers, dt)</w:t>
-            </w:r>
-          </w:p>
-        </w:tc>
-        <w:tc>
-          <w:tcPr>
-            <w:tcW w:type="dxa" w:w="4320"/>
-          </w:tcPr>
-          <w:p>
-            <w:r>
-              <w:t>Giữ trái/phải đi liên tục kiểu DAS: frame đầu đi ngay 1 ô, giữ quá 0.18s thì mỗi 0.06s đi thêm 1 ô; giữ cả 2 phím thì đứng yên</w:t>
+              <w:t>Giữ trái/phải đi liên tục kiểu DAS, mỗi người chơi 1 đồng hồ riêng</w:t>
             </w:r>
           </w:p>
         </w:tc>
@@ -1596,7 +1052,7 @@
           </w:tcPr>
           <w:p>
             <w:r>
-              <w:t>Bộ phím 2P: P1 = A/D/W/S + Space; P2 = mũi tên + Enter</w:t>
+              <w:t>P1 = A/D/W/S + Space; P2 = mũi tên + Enter</w:t>
             </w:r>
           </w:p>
         </w:tc>
@@ -1608,7 +1064,7 @@
           </w:tcPr>
           <w:p>
             <w:r>
-              <w:t>Xử lý playing (1P)</w:t>
+              <w:t>Luật kết thúc 2P</w:t>
             </w:r>
           </w:p>
         </w:tc>
@@ -1618,29 +1074,7 @@
           </w:tcPr>
           <w:p>
             <w:r>
-              <w:t>W xoay, Space hard-drop; P pause, R chơi lại khi thua, ESC về menu</w:t>
-            </w:r>
-          </w:p>
-        </w:tc>
-      </w:tr>
-      <w:tr>
-        <w:tc>
-          <w:tcPr>
-            <w:tcW w:type="dxa" w:w="4320"/>
-          </w:tcPr>
-          <w:p>
-            <w:r>
-              <w:t>Xử lý playing_2p</w:t>
-            </w:r>
-          </w:p>
-        </w:tc>
-        <w:tc>
-          <w:tcPr>
-            <w:tcW w:type="dxa" w:w="4320"/>
-          </w:tcPr>
-          <w:p>
-            <w:r>
-              <w:t>Xoay/roi ngay theo bộ phím riêng từng người; P pause; khi 1 bên thua thì dừng trận, R chơi lại cùng độ khó (rematch), ESC về menu</w:t>
+              <w:t>Một bên hết chỗ thì bên đó dừng, bên còn lại chơi tiếp; chỉ kết thúc khi CẢ 2 đều thua. Khi đó so điểm: ai cao hơn thắng, bằng điểm thì hòa</w:t>
             </w:r>
           </w:p>
         </w:tc>
@@ -1662,29 +1096,7 @@
           </w:tcPr>
           <w:p>
             <w:r>
-              <w:t>Làm mờ 2 board, hiện 'Px THANG!' + điểm 2 bên + nhắc R chơi lại</w:t>
-            </w:r>
-          </w:p>
-        </w:tc>
-      </w:tr>
-      <w:tr>
-        <w:tc>
-          <w:tcPr>
-            <w:tcW w:type="dxa" w:w="4320"/>
-          </w:tcPr>
-          <w:p>
-            <w:r>
-              <w:t>Vẽ 2P</w:t>
-            </w:r>
-          </w:p>
-        </w:tc>
-        <w:tc>
-          <w:tcPr>
-            <w:tcW w:type="dxa" w:w="4320"/>
-          </w:tcPr>
-          <w:p>
-            <w:r>
-              <w:t>Hai board cạnh nhau ngăn bằng vạch dọc, nhãn P1/P2 ở mỗi panel</w:t>
+              <w:t>Hiện 'P1 THANG!' / 'P2 THANG!' / 'HOA!' theo điểm + điểm 2 bên + nhắc R chơi lại (rematch cùng độ khó), ESC về menu</w:t>
             </w:r>
           </w:p>
         </w:tc>
@@ -1696,63 +1108,7 @@
         <w:pStyle w:val="Heading1"/>
       </w:pPr>
       <w:r>
-        <w:t>7. Ví dụ vòng đời 1 khối</w:t>
-      </w:r>
-    </w:p>
-    <w:p>
-      <w:pPr>
-        <w:pStyle w:val="ListBullet"/>
-      </w:pPr>
-      <w:r>
-        <w:t>1. _spawn() lấy khối tại vị trí (base + piece_count) từ chuỗi chung, căn giữa, hiện ở đỉnh.</w:t>
-      </w:r>
-    </w:p>
-    <w:p>
-      <w:pPr>
-        <w:pStyle w:val="ListBullet"/>
-      </w:pPr>
-      <w:r>
-        <w:t>2. Mỗi frame update(dt): chưa chạm đáy thì rơi theo tốc độ; giữ phím rơi nhanh thì 0.05s/ô.</w:t>
-      </w:r>
-    </w:p>
-    <w:p>
-      <w:pPr>
-        <w:pStyle w:val="ListBullet"/>
-      </w:pPr>
-      <w:r>
-        <w:t>3. Người chơi đi trái/phải, xoay (wall-kick tự dịch chuyển nếu kẹt).</w:t>
-      </w:r>
-    </w:p>
-    <w:p>
-      <w:pPr>
-        <w:pStyle w:val="ListBullet"/>
-      </w:pPr>
-      <w:r>
-        <w:t>4. Chạm đáy: đồng hồ lock 0.5s, kịp trượt/xoay cứu (gia hạn tối đa 15 lần).</w:t>
-      </w:r>
-    </w:p>
-    <w:p>
-      <w:pPr>
-        <w:pStyle w:val="ListBullet"/>
-      </w:pPr>
-      <w:r>
-        <w:t>5. Hết giờ (hoặc hard-drop): lock() tô màu lên grid → clear_lines() ăn hàng + điểm.</w:t>
-      </w:r>
-    </w:p>
-    <w:p>
-      <w:pPr>
-        <w:pStyle w:val="ListBullet"/>
-      </w:pPr>
-      <w:r>
-        <w:t>6. _spawn() khối mới; nếu đè lên gạch cũ → game_over. 1P: màn hình thua + R chơi lại. 2P: hiện Px THANG! + R rematch.</w:t>
-      </w:r>
-    </w:p>
-    <w:p>
-      <w:pPr>
-        <w:pStyle w:val="Heading1"/>
-      </w:pPr>
-      <w:r>
-        <w:t>8. Bảng phím điều khiển</w:t>
+        <w:t>7. Bảng phím điều khiển</w:t>
       </w:r>
     </w:p>
     <w:tbl>
@@ -1860,7 +1216,7 @@
           </w:tcPr>
           <w:p>
             <w:r>
-              <w:t>S (giữ)</w:t>
+              <w:t>S (giữ) / W</w:t>
             </w:r>
           </w:p>
         </w:tc>
@@ -1870,39 +1226,7 @@
           </w:tcPr>
           <w:p>
             <w:r>
-              <w:t>Rơi nhanh (soft-drop)</w:t>
-            </w:r>
-          </w:p>
-        </w:tc>
-      </w:tr>
-      <w:tr>
-        <w:tc>
-          <w:tcPr>
-            <w:tcW w:type="dxa" w:w="2880"/>
-          </w:tcPr>
-          <w:p>
-            <w:r>
-              <w:t>1P</w:t>
-            </w:r>
-          </w:p>
-        </w:tc>
-        <w:tc>
-          <w:tcPr>
-            <w:tcW w:type="dxa" w:w="2880"/>
-          </w:tcPr>
-          <w:p>
-            <w:r>
-              <w:t>W</w:t>
-            </w:r>
-          </w:p>
-        </w:tc>
-        <w:tc>
-          <w:tcPr>
-            <w:tcW w:type="dxa" w:w="2880"/>
-          </w:tcPr>
-          <w:p>
-            <w:r>
-              <w:t>Xoay khối</w:t>
+              <w:t>Rơi nhanh / xoay khối</w:t>
             </w:r>
           </w:p>
         </w:tc>
@@ -1934,7 +1258,7 @@
           </w:tcPr>
           <w:p>
             <w:r>
-              <w:t>Rơi ngay xuống đáy (hard-drop)</w:t>
+              <w:t>Rơi ngay xuống đáy</w:t>
             </w:r>
           </w:p>
         </w:tc>
@@ -2522,10 +1846,10 @@
       <w:outlineLvl w:val="2"/>
     </w:pPr>
     <w:rPr>
-      <w:rFonts w:asciiTheme="majorHAnsi" w:eastAsiaTheme="majorEastAsia" w:hAnsiTheme="majorHAnsi" w:cstheme="majorBidi"/>
+      <w:rFonts w:asciiTheme="majorHAnsi" w:eastAsiaTheme="majorEastAsia" w:hAnsiTheme="majorHAnsi" w:cstheme="majorBidi" w:ascii="Times New Roman" w:hAnsi="Times New Roman"/>
       <w:b/>
       <w:bCs/>
-      <w:color w:val="4F81BD" w:themeColor="accent1"/>
+      <w:color w:val="000000"/>
     </w:rPr>
   </w:style>
   <w:style w:type="paragraph" w:styleId="Heading4">

</xml_diff>